<commit_message>
updated the work document API TESTS
</commit_message>
<xml_diff>
--- a/api/src/main/resources/API TESTS.docx
+++ b/api/src/main/resources/API TESTS.docx
@@ -67,6 +67,9 @@
         <w:jc w:val="center"/>
       </w:pPr>
       <w:r>
+        <w:rPr>
+          <w:noProof/>
+        </w:rPr>
         <w:drawing>
           <wp:inline distT="0" distB="0" distL="0" distR="0" wp14:anchorId="337DD938" wp14:editId="4F44C0D0">
             <wp:extent cx="5731510" cy="2257425"/>
@@ -109,7 +112,7 @@
         <w:pStyle w:val="Caption"/>
         <w:jc w:val="center"/>
       </w:pPr>
-      <w:bookmarkStart w:id="0" w:name="_Toc240224259"/>
+      <w:bookmarkStart w:id="0" w:name="_Toc240226776"/>
       <w:r>
         <w:t xml:space="preserve">Figure </w:t>
       </w:r>
@@ -126,26 +129,18 @@
       </w:r>
       <w:bookmarkEnd w:id="0"/>
     </w:p>
+    <w:p/>
     <w:p>
       <w:pPr>
         <w:keepNext/>
         <w:jc w:val="center"/>
       </w:pPr>
       <w:r>
-        <w:br/>
-      </w:r>
-      <w:r>
-        <w:br/>
-      </w:r>
-      <w:r>
-        <w:rPr>
-          <w:noProof/>
-        </w:rPr>
         <w:drawing>
-          <wp:inline distT="0" distB="0" distL="0" distR="0" wp14:anchorId="4BC55A62" wp14:editId="6EDB2821">
-            <wp:extent cx="3853001" cy="3617843"/>
-            <wp:effectExtent l="0" t="0" r="0" b="1905"/>
-            <wp:docPr id="192250819" name="Picture 1"/>
+          <wp:inline distT="0" distB="0" distL="0" distR="0" wp14:anchorId="77583D4E" wp14:editId="0EEE2DF0">
+            <wp:extent cx="4222143" cy="3661280"/>
+            <wp:effectExtent l="0" t="0" r="6985" b="0"/>
+            <wp:docPr id="706166151" name="Picture 1"/>
             <wp:cNvGraphicFramePr>
               <a:graphicFrameLocks xmlns:a="http://schemas.openxmlformats.org/drawingml/2006/main" noChangeAspect="1"/>
             </wp:cNvGraphicFramePr>
@@ -153,36 +148,23 @@
               <a:graphicData uri="http://schemas.openxmlformats.org/drawingml/2006/picture">
                 <pic:pic xmlns:pic="http://schemas.openxmlformats.org/drawingml/2006/picture">
                   <pic:nvPicPr>
-                    <pic:cNvPr id="0" name="Picture 1"/>
-                    <pic:cNvPicPr>
-                      <a:picLocks noChangeAspect="1" noChangeArrowheads="1"/>
-                    </pic:cNvPicPr>
+                    <pic:cNvPr id="706166151" name=""/>
+                    <pic:cNvPicPr/>
                   </pic:nvPicPr>
                   <pic:blipFill>
-                    <a:blip r:embed="rId8">
-                      <a:extLst>
-                        <a:ext uri="{28A0092B-C50C-407E-A947-70E740481C1C}">
-                          <a14:useLocalDpi xmlns:a14="http://schemas.microsoft.com/office/drawing/2010/main" val="0"/>
-                        </a:ext>
-                      </a:extLst>
-                    </a:blip>
-                    <a:srcRect/>
+                    <a:blip r:embed="rId8"/>
                     <a:stretch>
                       <a:fillRect/>
                     </a:stretch>
                   </pic:blipFill>
-                  <pic:spPr bwMode="auto">
+                  <pic:spPr>
                     <a:xfrm>
                       <a:off x="0" y="0"/>
-                      <a:ext cx="3858698" cy="3623192"/>
+                      <a:ext cx="4226922" cy="3665425"/>
                     </a:xfrm>
                     <a:prstGeom prst="rect">
                       <a:avLst/>
                     </a:prstGeom>
-                    <a:noFill/>
-                    <a:ln>
-                      <a:noFill/>
-                    </a:ln>
                   </pic:spPr>
                 </pic:pic>
               </a:graphicData>
@@ -196,7 +178,7 @@
         <w:pStyle w:val="Caption"/>
         <w:jc w:val="center"/>
       </w:pPr>
-      <w:bookmarkStart w:id="1" w:name="_Toc240224260"/>
+      <w:bookmarkStart w:id="1" w:name="_Toc240226777"/>
       <w:r>
         <w:t xml:space="preserve">Figure </w:t>
       </w:r>
@@ -209,30 +191,31 @@
         </w:r>
       </w:fldSimple>
       <w:r>
-        <w:t xml:space="preserve"> - Swagger item read</w:t>
+        <w:t xml:space="preserve"> - users/me </w:t>
+      </w:r>
+      <w:proofErr w:type="spellStart"/>
+      <w:r>
+        <w:t>api</w:t>
+      </w:r>
+      <w:proofErr w:type="spellEnd"/>
+      <w:r>
+        <w:t xml:space="preserve"> on swagger</w:t>
       </w:r>
       <w:bookmarkEnd w:id="1"/>
     </w:p>
-    <w:p>
-      <w:pPr>
-        <w:jc w:val="center"/>
-      </w:pPr>
-    </w:p>
+    <w:p/>
     <w:p>
       <w:pPr>
         <w:keepNext/>
         <w:jc w:val="center"/>
       </w:pPr>
       <w:r>
-        <w:rPr>
-          <w:noProof/>
-        </w:rPr>
         <w:lastRenderedPageBreak/>
         <w:drawing>
-          <wp:inline distT="0" distB="0" distL="0" distR="0" wp14:anchorId="3566D9F8" wp14:editId="50EE84DB">
-            <wp:extent cx="4524292" cy="2544663"/>
-            <wp:effectExtent l="0" t="0" r="0" b="8255"/>
-            <wp:docPr id="310247693" name="Picture 2"/>
+          <wp:inline distT="0" distB="0" distL="0" distR="0" wp14:anchorId="6FB7283E" wp14:editId="15092796">
+            <wp:extent cx="4651513" cy="3312129"/>
+            <wp:effectExtent l="0" t="0" r="0" b="3175"/>
+            <wp:docPr id="1169983193" name="Picture 1"/>
             <wp:cNvGraphicFramePr>
               <a:graphicFrameLocks xmlns:a="http://schemas.openxmlformats.org/drawingml/2006/main" noChangeAspect="1"/>
             </wp:cNvGraphicFramePr>
@@ -240,36 +223,23 @@
               <a:graphicData uri="http://schemas.openxmlformats.org/drawingml/2006/picture">
                 <pic:pic xmlns:pic="http://schemas.openxmlformats.org/drawingml/2006/picture">
                   <pic:nvPicPr>
-                    <pic:cNvPr id="0" name="Picture 2"/>
-                    <pic:cNvPicPr>
-                      <a:picLocks noChangeAspect="1" noChangeArrowheads="1"/>
-                    </pic:cNvPicPr>
+                    <pic:cNvPr id="1169983193" name=""/>
+                    <pic:cNvPicPr/>
                   </pic:nvPicPr>
                   <pic:blipFill>
-                    <a:blip r:embed="rId9" cstate="print">
-                      <a:extLst>
-                        <a:ext uri="{28A0092B-C50C-407E-A947-70E740481C1C}">
-                          <a14:useLocalDpi xmlns:a14="http://schemas.microsoft.com/office/drawing/2010/main" val="0"/>
-                        </a:ext>
-                      </a:extLst>
-                    </a:blip>
-                    <a:srcRect/>
+                    <a:blip r:embed="rId9"/>
                     <a:stretch>
                       <a:fillRect/>
                     </a:stretch>
                   </pic:blipFill>
-                  <pic:spPr bwMode="auto">
+                  <pic:spPr>
                     <a:xfrm>
                       <a:off x="0" y="0"/>
-                      <a:ext cx="4535730" cy="2551096"/>
+                      <a:ext cx="4655227" cy="3314773"/>
                     </a:xfrm>
                     <a:prstGeom prst="rect">
                       <a:avLst/>
                     </a:prstGeom>
-                    <a:noFill/>
-                    <a:ln>
-                      <a:noFill/>
-                    </a:ln>
                   </pic:spPr>
                 </pic:pic>
               </a:graphicData>
@@ -283,7 +253,7 @@
         <w:pStyle w:val="Caption"/>
         <w:jc w:val="center"/>
       </w:pPr>
-      <w:bookmarkStart w:id="2" w:name="_Toc240224261"/>
+      <w:bookmarkStart w:id="2" w:name="_Toc240226778"/>
       <w:r>
         <w:t xml:space="preserve">Figure </w:t>
       </w:r>
@@ -296,344 +266,30 @@
         </w:r>
       </w:fldSimple>
       <w:r>
-        <w:t xml:space="preserve"> - Firestore read wear limit 7</w:t>
+        <w:t xml:space="preserve"> - users/me/settings </w:t>
+      </w:r>
+      <w:proofErr w:type="spellStart"/>
+      <w:r>
+        <w:t>api</w:t>
+      </w:r>
+      <w:proofErr w:type="spellEnd"/>
+      <w:r>
+        <w:t xml:space="preserve"> on swagger</w:t>
       </w:r>
       <w:bookmarkEnd w:id="2"/>
     </w:p>
+    <w:p/>
     <w:p>
       <w:pPr>
         <w:keepNext/>
         <w:jc w:val="center"/>
       </w:pPr>
       <w:r>
-        <w:rPr>
-          <w:noProof/>
-        </w:rPr>
-        <w:lastRenderedPageBreak/>
-        <w:drawing>
-          <wp:inline distT="0" distB="0" distL="0" distR="0" wp14:anchorId="364FAA2B" wp14:editId="29E75326">
-            <wp:extent cx="3150261" cy="7005099"/>
-            <wp:effectExtent l="0" t="0" r="0" b="5715"/>
-            <wp:docPr id="956464035" name="Picture 3"/>
-            <wp:cNvGraphicFramePr>
-              <a:graphicFrameLocks xmlns:a="http://schemas.openxmlformats.org/drawingml/2006/main" noChangeAspect="1"/>
-            </wp:cNvGraphicFramePr>
-            <a:graphic xmlns:a="http://schemas.openxmlformats.org/drawingml/2006/main">
-              <a:graphicData uri="http://schemas.openxmlformats.org/drawingml/2006/picture">
-                <pic:pic xmlns:pic="http://schemas.openxmlformats.org/drawingml/2006/picture">
-                  <pic:nvPicPr>
-                    <pic:cNvPr id="0" name="Picture 3"/>
-                    <pic:cNvPicPr>
-                      <a:picLocks noChangeAspect="1" noChangeArrowheads="1"/>
-                    </pic:cNvPicPr>
-                  </pic:nvPicPr>
-                  <pic:blipFill>
-                    <a:blip r:embed="rId10" cstate="print">
-                      <a:extLst>
-                        <a:ext uri="{28A0092B-C50C-407E-A947-70E740481C1C}">
-                          <a14:useLocalDpi xmlns:a14="http://schemas.microsoft.com/office/drawing/2010/main" val="0"/>
-                        </a:ext>
-                      </a:extLst>
-                    </a:blip>
-                    <a:srcRect/>
-                    <a:stretch>
-                      <a:fillRect/>
-                    </a:stretch>
-                  </pic:blipFill>
-                  <pic:spPr bwMode="auto">
-                    <a:xfrm>
-                      <a:off x="0" y="0"/>
-                      <a:ext cx="3153983" cy="7013374"/>
-                    </a:xfrm>
-                    <a:prstGeom prst="rect">
-                      <a:avLst/>
-                    </a:prstGeom>
-                    <a:noFill/>
-                    <a:ln>
-                      <a:noFill/>
-                    </a:ln>
-                  </pic:spPr>
-                </pic:pic>
-              </a:graphicData>
-            </a:graphic>
-          </wp:inline>
-        </w:drawing>
-      </w:r>
-    </w:p>
-    <w:p>
-      <w:pPr>
-        <w:pStyle w:val="Caption"/>
-        <w:jc w:val="center"/>
-      </w:pPr>
-      <w:bookmarkStart w:id="3" w:name="_Toc240224262"/>
-      <w:r>
-        <w:t xml:space="preserve">Figure </w:t>
-      </w:r>
-      <w:fldSimple w:instr=" SEQ Figure \* ARABIC ">
-        <w:r>
-          <w:rPr>
-            <w:noProof/>
-          </w:rPr>
-          <w:t>4</w:t>
-        </w:r>
-      </w:fldSimple>
-      <w:r>
-        <w:t xml:space="preserve"> - android read wear limit 7</w:t>
-      </w:r>
-      <w:bookmarkEnd w:id="3"/>
-    </w:p>
-    <w:p>
-      <w:pPr>
-        <w:keepNext/>
-        <w:jc w:val="center"/>
-      </w:pPr>
-      <w:r>
-        <w:rPr>
-          <w:noProof/>
-        </w:rPr>
-        <w:lastRenderedPageBreak/>
-        <w:drawing>
-          <wp:inline distT="0" distB="0" distL="0" distR="0" wp14:anchorId="57470E1C" wp14:editId="29728865">
-            <wp:extent cx="3050139" cy="6782463"/>
-            <wp:effectExtent l="0" t="0" r="0" b="0"/>
-            <wp:docPr id="1058557186" name="Picture 4"/>
-            <wp:cNvGraphicFramePr>
-              <a:graphicFrameLocks xmlns:a="http://schemas.openxmlformats.org/drawingml/2006/main" noChangeAspect="1"/>
-            </wp:cNvGraphicFramePr>
-            <a:graphic xmlns:a="http://schemas.openxmlformats.org/drawingml/2006/main">
-              <a:graphicData uri="http://schemas.openxmlformats.org/drawingml/2006/picture">
-                <pic:pic xmlns:pic="http://schemas.openxmlformats.org/drawingml/2006/picture">
-                  <pic:nvPicPr>
-                    <pic:cNvPr id="0" name="Picture 4"/>
-                    <pic:cNvPicPr>
-                      <a:picLocks noChangeAspect="1" noChangeArrowheads="1"/>
-                    </pic:cNvPicPr>
-                  </pic:nvPicPr>
-                  <pic:blipFill>
-                    <a:blip r:embed="rId11" cstate="print">
-                      <a:extLst>
-                        <a:ext uri="{28A0092B-C50C-407E-A947-70E740481C1C}">
-                          <a14:useLocalDpi xmlns:a14="http://schemas.microsoft.com/office/drawing/2010/main" val="0"/>
-                        </a:ext>
-                      </a:extLst>
-                    </a:blip>
-                    <a:srcRect/>
-                    <a:stretch>
-                      <a:fillRect/>
-                    </a:stretch>
-                  </pic:blipFill>
-                  <pic:spPr bwMode="auto">
-                    <a:xfrm>
-                      <a:off x="0" y="0"/>
-                      <a:ext cx="3050998" cy="6784373"/>
-                    </a:xfrm>
-                    <a:prstGeom prst="rect">
-                      <a:avLst/>
-                    </a:prstGeom>
-                    <a:noFill/>
-                    <a:ln>
-                      <a:noFill/>
-                    </a:ln>
-                  </pic:spPr>
-                </pic:pic>
-              </a:graphicData>
-            </a:graphic>
-          </wp:inline>
-        </w:drawing>
-      </w:r>
-    </w:p>
-    <w:p>
-      <w:pPr>
-        <w:pStyle w:val="Caption"/>
-        <w:jc w:val="center"/>
-      </w:pPr>
-      <w:bookmarkStart w:id="4" w:name="_Toc240224263"/>
-      <w:r>
-        <w:t xml:space="preserve">Figure </w:t>
-      </w:r>
-      <w:fldSimple w:instr=" SEQ Figure \* ARABIC ">
-        <w:r>
-          <w:rPr>
-            <w:noProof/>
-          </w:rPr>
-          <w:t>5</w:t>
-        </w:r>
-      </w:fldSimple>
-      <w:r>
-        <w:t xml:space="preserve"> - android wear limit read 8</w:t>
-      </w:r>
-      <w:bookmarkEnd w:id="4"/>
-    </w:p>
-    <w:p>
-      <w:pPr>
-        <w:keepNext/>
-        <w:jc w:val="center"/>
-      </w:pPr>
-      <w:r>
-        <w:rPr>
-          <w:noProof/>
-        </w:rPr>
-        <w:lastRenderedPageBreak/>
-        <w:drawing>
-          <wp:inline distT="0" distB="0" distL="0" distR="0" wp14:anchorId="45FA431C" wp14:editId="16B24ADC">
-            <wp:extent cx="4858247" cy="2732495"/>
-            <wp:effectExtent l="0" t="0" r="0" b="0"/>
-            <wp:docPr id="288633782" name="Picture 6"/>
-            <wp:cNvGraphicFramePr>
-              <a:graphicFrameLocks xmlns:a="http://schemas.openxmlformats.org/drawingml/2006/main" noChangeAspect="1"/>
-            </wp:cNvGraphicFramePr>
-            <a:graphic xmlns:a="http://schemas.openxmlformats.org/drawingml/2006/main">
-              <a:graphicData uri="http://schemas.openxmlformats.org/drawingml/2006/picture">
-                <pic:pic xmlns:pic="http://schemas.openxmlformats.org/drawingml/2006/picture">
-                  <pic:nvPicPr>
-                    <pic:cNvPr id="0" name="Picture 6"/>
-                    <pic:cNvPicPr>
-                      <a:picLocks noChangeAspect="1" noChangeArrowheads="1"/>
-                    </pic:cNvPicPr>
-                  </pic:nvPicPr>
-                  <pic:blipFill>
-                    <a:blip r:embed="rId12" cstate="print">
-                      <a:extLst>
-                        <a:ext uri="{28A0092B-C50C-407E-A947-70E740481C1C}">
-                          <a14:useLocalDpi xmlns:a14="http://schemas.microsoft.com/office/drawing/2010/main" val="0"/>
-                        </a:ext>
-                      </a:extLst>
-                    </a:blip>
-                    <a:srcRect/>
-                    <a:stretch>
-                      <a:fillRect/>
-                    </a:stretch>
-                  </pic:blipFill>
-                  <pic:spPr bwMode="auto">
-                    <a:xfrm>
-                      <a:off x="0" y="0"/>
-                      <a:ext cx="4862722" cy="2735012"/>
-                    </a:xfrm>
-                    <a:prstGeom prst="rect">
-                      <a:avLst/>
-                    </a:prstGeom>
-                    <a:noFill/>
-                    <a:ln>
-                      <a:noFill/>
-                    </a:ln>
-                  </pic:spPr>
-                </pic:pic>
-              </a:graphicData>
-            </a:graphic>
-          </wp:inline>
-        </w:drawing>
-      </w:r>
-    </w:p>
-    <w:p>
-      <w:pPr>
-        <w:pStyle w:val="Caption"/>
-        <w:jc w:val="center"/>
-      </w:pPr>
-      <w:bookmarkStart w:id="5" w:name="_Toc240224264"/>
-      <w:r>
-        <w:t xml:space="preserve">Figure </w:t>
-      </w:r>
-      <w:fldSimple w:instr=" SEQ Figure \* ARABIC ">
-        <w:r>
-          <w:rPr>
-            <w:noProof/>
-          </w:rPr>
-          <w:t>6</w:t>
-        </w:r>
-      </w:fldSimple>
-      <w:r>
-        <w:t xml:space="preserve"> - </w:t>
-      </w:r>
-      <w:proofErr w:type="spellStart"/>
-      <w:r>
-        <w:t>firestore</w:t>
-      </w:r>
-      <w:proofErr w:type="spellEnd"/>
-      <w:r>
-        <w:t xml:space="preserve"> wear limit 8 read</w:t>
-      </w:r>
-      <w:bookmarkEnd w:id="5"/>
-    </w:p>
-    <w:p>
-      <w:pPr>
-        <w:keepNext/>
-        <w:jc w:val="center"/>
-      </w:pPr>
-      <w:r>
-        <w:rPr>
-          <w:noProof/>
-        </w:rPr>
-        <w:drawing>
-          <wp:inline distT="0" distB="0" distL="0" distR="0" wp14:anchorId="0DF3FC09" wp14:editId="5F75BBFC">
-            <wp:extent cx="5139840" cy="1645920"/>
-            <wp:effectExtent l="0" t="0" r="3810" b="0"/>
-            <wp:docPr id="184916453" name="Picture 7"/>
-            <wp:cNvGraphicFramePr>
-              <a:graphicFrameLocks xmlns:a="http://schemas.openxmlformats.org/drawingml/2006/main" noChangeAspect="1"/>
-            </wp:cNvGraphicFramePr>
-            <a:graphic xmlns:a="http://schemas.openxmlformats.org/drawingml/2006/main">
-              <a:graphicData uri="http://schemas.openxmlformats.org/drawingml/2006/picture">
-                <pic:pic xmlns:pic="http://schemas.openxmlformats.org/drawingml/2006/picture">
-                  <pic:nvPicPr>
-                    <pic:cNvPr id="0" name="Picture 7"/>
-                    <pic:cNvPicPr>
-                      <a:picLocks noChangeAspect="1" noChangeArrowheads="1"/>
-                    </pic:cNvPicPr>
-                  </pic:nvPicPr>
-                  <pic:blipFill>
-                    <a:blip r:embed="rId13">
-                      <a:extLst>
-                        <a:ext uri="{28A0092B-C50C-407E-A947-70E740481C1C}">
-                          <a14:useLocalDpi xmlns:a14="http://schemas.microsoft.com/office/drawing/2010/main" val="0"/>
-                        </a:ext>
-                      </a:extLst>
-                    </a:blip>
-                    <a:srcRect/>
-                    <a:stretch>
-                      <a:fillRect/>
-                    </a:stretch>
-                  </pic:blipFill>
-                  <pic:spPr bwMode="auto">
-                    <a:xfrm>
-                      <a:off x="0" y="0"/>
-                      <a:ext cx="5143680" cy="1647150"/>
-                    </a:xfrm>
-                    <a:prstGeom prst="rect">
-                      <a:avLst/>
-                    </a:prstGeom>
-                    <a:noFill/>
-                    <a:ln>
-                      <a:noFill/>
-                    </a:ln>
-                  </pic:spPr>
-                </pic:pic>
-              </a:graphicData>
-            </a:graphic>
-          </wp:inline>
-        </w:drawing>
-      </w:r>
-    </w:p>
-    <w:p>
-      <w:pPr>
-        <w:pStyle w:val="Caption"/>
-        <w:jc w:val="center"/>
-      </w:pPr>
-      <w:bookmarkStart w:id="6" w:name="_Toc240224265"/>
-      <w:r>
-        <w:t xml:space="preserve">Figure </w:t>
-      </w:r>
-      <w:fldSimple w:instr=" SEQ Figure \* ARABIC ">
-        <w:r>
-          <w:rPr>
-            <w:noProof/>
-          </w:rPr>
-          <w:t>7</w:t>
-        </w:r>
-      </w:fldSimple>
-      <w:r>
-        <w:t xml:space="preserve"> - swagger settings limit 8</w:t>
-      </w:r>
-      <w:bookmarkEnd w:id="6"/>
+        <w:br/>
+      </w:r>
+      <w:r>
+        <w:br/>
+      </w:r>
     </w:p>
     <w:p/>
     <w:p>
@@ -670,7 +326,7 @@
           <w:lang w:eastAsia="en-ZA"/>
         </w:rPr>
       </w:pPr>
-      <w:hyperlink w:anchor="_Toc240224259" w:history="1">
+      <w:hyperlink w:anchor="_Toc240226776" w:history="1">
         <w:r>
           <w:rPr>
             <w:rStyle w:val="Hyperlink"/>
@@ -697,7 +353,7 @@
             <w:noProof/>
             <w:webHidden/>
           </w:rPr>
-          <w:instrText xml:space="preserve"> PAGEREF _Toc240224259 \h </w:instrText>
+          <w:instrText xml:space="preserve"> PAGEREF _Toc240226776 \h </w:instrText>
         </w:r>
         <w:r>
           <w:rPr>
@@ -742,13 +398,13 @@
           <w:lang w:eastAsia="en-ZA"/>
         </w:rPr>
       </w:pPr>
-      <w:hyperlink w:anchor="_Toc240224260" w:history="1">
+      <w:hyperlink w:anchor="_Toc240226777" w:history="1">
         <w:r>
           <w:rPr>
             <w:rStyle w:val="Hyperlink"/>
             <w:noProof/>
           </w:rPr>
-          <w:t>Figure 2 - Swagger item read</w:t>
+          <w:t>Figure 2 - users/me api on swagger</w:t>
         </w:r>
         <w:r>
           <w:rPr>
@@ -769,7 +425,7 @@
             <w:noProof/>
             <w:webHidden/>
           </w:rPr>
-          <w:instrText xml:space="preserve"> PAGEREF _Toc240224260 \h </w:instrText>
+          <w:instrText xml:space="preserve"> PAGEREF _Toc240226777 \h </w:instrText>
         </w:r>
         <w:r>
           <w:rPr>
@@ -814,13 +470,13 @@
           <w:lang w:eastAsia="en-ZA"/>
         </w:rPr>
       </w:pPr>
-      <w:hyperlink w:anchor="_Toc240224261" w:history="1">
+      <w:hyperlink w:anchor="_Toc240226778" w:history="1">
         <w:r>
           <w:rPr>
             <w:rStyle w:val="Hyperlink"/>
             <w:noProof/>
           </w:rPr>
-          <w:t>Figure 3 - Firestore read wear limit 7</w:t>
+          <w:t>Figure 3 - users/me/settings api on swagger</w:t>
         </w:r>
         <w:r>
           <w:rPr>
@@ -841,7 +497,7 @@
             <w:noProof/>
             <w:webHidden/>
           </w:rPr>
-          <w:instrText xml:space="preserve"> PAGEREF _Toc240224261 \h </w:instrText>
+          <w:instrText xml:space="preserve"> PAGEREF _Toc240226778 \h </w:instrText>
         </w:r>
         <w:r>
           <w:rPr>
@@ -862,294 +518,6 @@
             <w:webHidden/>
           </w:rPr>
           <w:t>2</w:t>
-        </w:r>
-        <w:r>
-          <w:rPr>
-            <w:noProof/>
-            <w:webHidden/>
-          </w:rPr>
-          <w:fldChar w:fldCharType="end"/>
-        </w:r>
-      </w:hyperlink>
-    </w:p>
-    <w:p>
-      <w:pPr>
-        <w:pStyle w:val="TableofFigures"/>
-        <w:tabs>
-          <w:tab w:val="right" w:leader="dot" w:pos="9016"/>
-        </w:tabs>
-        <w:rPr>
-          <w:rFonts w:eastAsiaTheme="minorEastAsia"/>
-          <w:noProof/>
-          <w:sz w:val="24"/>
-          <w:szCs w:val="24"/>
-          <w:lang w:eastAsia="en-ZA"/>
-        </w:rPr>
-      </w:pPr>
-      <w:hyperlink w:anchor="_Toc240224262" w:history="1">
-        <w:r>
-          <w:rPr>
-            <w:rStyle w:val="Hyperlink"/>
-            <w:noProof/>
-          </w:rPr>
-          <w:t>Figure 4 - android read wear limit 7</w:t>
-        </w:r>
-        <w:r>
-          <w:rPr>
-            <w:noProof/>
-            <w:webHidden/>
-          </w:rPr>
-          <w:tab/>
-        </w:r>
-        <w:r>
-          <w:rPr>
-            <w:noProof/>
-            <w:webHidden/>
-          </w:rPr>
-          <w:fldChar w:fldCharType="begin"/>
-        </w:r>
-        <w:r>
-          <w:rPr>
-            <w:noProof/>
-            <w:webHidden/>
-          </w:rPr>
-          <w:instrText xml:space="preserve"> PAGEREF _Toc240224262 \h </w:instrText>
-        </w:r>
-        <w:r>
-          <w:rPr>
-            <w:noProof/>
-            <w:webHidden/>
-          </w:rPr>
-        </w:r>
-        <w:r>
-          <w:rPr>
-            <w:noProof/>
-            <w:webHidden/>
-          </w:rPr>
-          <w:fldChar w:fldCharType="separate"/>
-        </w:r>
-        <w:r>
-          <w:rPr>
-            <w:noProof/>
-            <w:webHidden/>
-          </w:rPr>
-          <w:t>3</w:t>
-        </w:r>
-        <w:r>
-          <w:rPr>
-            <w:noProof/>
-            <w:webHidden/>
-          </w:rPr>
-          <w:fldChar w:fldCharType="end"/>
-        </w:r>
-      </w:hyperlink>
-    </w:p>
-    <w:p>
-      <w:pPr>
-        <w:pStyle w:val="TableofFigures"/>
-        <w:tabs>
-          <w:tab w:val="right" w:leader="dot" w:pos="9016"/>
-        </w:tabs>
-        <w:rPr>
-          <w:rFonts w:eastAsiaTheme="minorEastAsia"/>
-          <w:noProof/>
-          <w:sz w:val="24"/>
-          <w:szCs w:val="24"/>
-          <w:lang w:eastAsia="en-ZA"/>
-        </w:rPr>
-      </w:pPr>
-      <w:hyperlink w:anchor="_Toc240224263" w:history="1">
-        <w:r>
-          <w:rPr>
-            <w:rStyle w:val="Hyperlink"/>
-            <w:noProof/>
-          </w:rPr>
-          <w:t>Figure 5 - android wear limit read 8</w:t>
-        </w:r>
-        <w:r>
-          <w:rPr>
-            <w:noProof/>
-            <w:webHidden/>
-          </w:rPr>
-          <w:tab/>
-        </w:r>
-        <w:r>
-          <w:rPr>
-            <w:noProof/>
-            <w:webHidden/>
-          </w:rPr>
-          <w:fldChar w:fldCharType="begin"/>
-        </w:r>
-        <w:r>
-          <w:rPr>
-            <w:noProof/>
-            <w:webHidden/>
-          </w:rPr>
-          <w:instrText xml:space="preserve"> PAGEREF _Toc240224263 \h </w:instrText>
-        </w:r>
-        <w:r>
-          <w:rPr>
-            <w:noProof/>
-            <w:webHidden/>
-          </w:rPr>
-        </w:r>
-        <w:r>
-          <w:rPr>
-            <w:noProof/>
-            <w:webHidden/>
-          </w:rPr>
-          <w:fldChar w:fldCharType="separate"/>
-        </w:r>
-        <w:r>
-          <w:rPr>
-            <w:noProof/>
-            <w:webHidden/>
-          </w:rPr>
-          <w:t>4</w:t>
-        </w:r>
-        <w:r>
-          <w:rPr>
-            <w:noProof/>
-            <w:webHidden/>
-          </w:rPr>
-          <w:fldChar w:fldCharType="end"/>
-        </w:r>
-      </w:hyperlink>
-    </w:p>
-    <w:p>
-      <w:pPr>
-        <w:pStyle w:val="TableofFigures"/>
-        <w:tabs>
-          <w:tab w:val="right" w:leader="dot" w:pos="9016"/>
-        </w:tabs>
-        <w:rPr>
-          <w:rFonts w:eastAsiaTheme="minorEastAsia"/>
-          <w:noProof/>
-          <w:sz w:val="24"/>
-          <w:szCs w:val="24"/>
-          <w:lang w:eastAsia="en-ZA"/>
-        </w:rPr>
-      </w:pPr>
-      <w:hyperlink w:anchor="_Toc240224264" w:history="1">
-        <w:r>
-          <w:rPr>
-            <w:rStyle w:val="Hyperlink"/>
-            <w:noProof/>
-          </w:rPr>
-          <w:t>Figure 6 - firestore wear limit 8 read</w:t>
-        </w:r>
-        <w:r>
-          <w:rPr>
-            <w:noProof/>
-            <w:webHidden/>
-          </w:rPr>
-          <w:tab/>
-        </w:r>
-        <w:r>
-          <w:rPr>
-            <w:noProof/>
-            <w:webHidden/>
-          </w:rPr>
-          <w:fldChar w:fldCharType="begin"/>
-        </w:r>
-        <w:r>
-          <w:rPr>
-            <w:noProof/>
-            <w:webHidden/>
-          </w:rPr>
-          <w:instrText xml:space="preserve"> PAGEREF _Toc240224264 \h </w:instrText>
-        </w:r>
-        <w:r>
-          <w:rPr>
-            <w:noProof/>
-            <w:webHidden/>
-          </w:rPr>
-        </w:r>
-        <w:r>
-          <w:rPr>
-            <w:noProof/>
-            <w:webHidden/>
-          </w:rPr>
-          <w:fldChar w:fldCharType="separate"/>
-        </w:r>
-        <w:r>
-          <w:rPr>
-            <w:noProof/>
-            <w:webHidden/>
-          </w:rPr>
-          <w:t>5</w:t>
-        </w:r>
-        <w:r>
-          <w:rPr>
-            <w:noProof/>
-            <w:webHidden/>
-          </w:rPr>
-          <w:fldChar w:fldCharType="end"/>
-        </w:r>
-      </w:hyperlink>
-    </w:p>
-    <w:p>
-      <w:pPr>
-        <w:pStyle w:val="TableofFigures"/>
-        <w:tabs>
-          <w:tab w:val="right" w:leader="dot" w:pos="9016"/>
-        </w:tabs>
-        <w:rPr>
-          <w:rFonts w:eastAsiaTheme="minorEastAsia"/>
-          <w:noProof/>
-          <w:sz w:val="24"/>
-          <w:szCs w:val="24"/>
-          <w:lang w:eastAsia="en-ZA"/>
-        </w:rPr>
-      </w:pPr>
-      <w:hyperlink w:anchor="_Toc240224265" w:history="1">
-        <w:r>
-          <w:rPr>
-            <w:rStyle w:val="Hyperlink"/>
-            <w:noProof/>
-          </w:rPr>
-          <w:t>Figure 7 - swagger settings limit 8</w:t>
-        </w:r>
-        <w:r>
-          <w:rPr>
-            <w:noProof/>
-            <w:webHidden/>
-          </w:rPr>
-          <w:tab/>
-        </w:r>
-        <w:r>
-          <w:rPr>
-            <w:noProof/>
-            <w:webHidden/>
-          </w:rPr>
-          <w:fldChar w:fldCharType="begin"/>
-        </w:r>
-        <w:r>
-          <w:rPr>
-            <w:noProof/>
-            <w:webHidden/>
-          </w:rPr>
-          <w:instrText xml:space="preserve"> PAGEREF _Toc240224265 \h </w:instrText>
-        </w:r>
-        <w:r>
-          <w:rPr>
-            <w:noProof/>
-            <w:webHidden/>
-          </w:rPr>
-        </w:r>
-        <w:r>
-          <w:rPr>
-            <w:noProof/>
-            <w:webHidden/>
-          </w:rPr>
-          <w:fldChar w:fldCharType="separate"/>
-        </w:r>
-        <w:r>
-          <w:rPr>
-            <w:noProof/>
-            <w:webHidden/>
-          </w:rPr>
-          <w:t>5</w:t>
         </w:r>
         <w:r>
           <w:rPr>

</xml_diff>